<commit_message>
Logs 1-3: point Verifiable Artifacts to public GitHub URLs
</commit_message>
<xml_diff>
--- a/04_Submission/ExperimentLogs/ExperimentLog_02_Signature_Methodology_By_Evidence.docx
+++ b/04_Submission/ExperimentLogs/ExperimentLog_02_Signature_Methodology_By_Evidence.docx
@@ -1700,35 +1700,14 @@
       </w:r>
     </w:p>
     <w:p>
-      <w:pPr>
-        <w:pStyle w:val="ListBullet"/>
-      </w:pPr>
       <w:r>
-        <w:rPr>
-          <w:rFonts w:ascii="Consolas" w:hAnsi="Consolas"/>
-          <w:sz w:val="20"/>
-        </w:rPr>
-        <w:t>05_Modeling/sig_depth_ab.py</w:t>
-      </w:r>
-      <w:r>
-        <w:t xml:space="preserve"> + </w:t>
+        <w:t xml:space="preserve">Public repository: </w:t>
       </w:r>
       <w:r>
         <w:rPr>
-          <w:rFonts w:ascii="Consolas" w:hAnsi="Consolas"/>
-          <w:sz w:val="20"/>
+          <w:b/>
         </w:rPr>
-        <w:t>sig_depth_ab_results.json</w:t>
-      </w:r>
-      <w:r>
-        <w:t xml:space="preserve"> + </w:t>
-      </w:r>
-      <w:r>
-        <w:rPr>
-          <w:rFonts w:ascii="Consolas" w:hAnsi="Consolas"/>
-          <w:sz w:val="20"/>
-        </w:rPr>
-        <w:t>03_Outputs/Charts/sig_depth_ab.png</w:t>
+        <w:t>https://github.com/Brothermoses/aquacascade-ai</w:t>
       </w:r>
     </w:p>
     <w:p>
@@ -1736,31 +1715,22 @@
         <w:pStyle w:val="ListBullet"/>
       </w:pPr>
       <w:r>
-        <w:rPr>
-          <w:rFonts w:ascii="Consolas" w:hAnsi="Consolas"/>
-          <w:sz w:val="20"/>
-        </w:rPr>
-        <w:t>05_Modeling/sig_calculus_ab.py</w:t>
+        <w:t>Depth A/B (script + JSON + chart):</w:t>
       </w:r>
+    </w:p>
+    <w:p>
       <w:r>
-        <w:t xml:space="preserve"> + </w:t>
+        <w:t>https://github.com/Brothermoses/aquacascade-ai/blob/main/05_Modeling/sig_depth_ab.py</w:t>
       </w:r>
+    </w:p>
+    <w:p>
       <w:r>
-        <w:rPr>
-          <w:rFonts w:ascii="Consolas" w:hAnsi="Consolas"/>
-          <w:sz w:val="20"/>
-        </w:rPr>
-        <w:t>sig_calculus_ab_results.json</w:t>
+        <w:t>· https://github.com/Brothermoses/aquacascade-ai/blob/main/05_Modeling/sig_depth_ab_results.json</w:t>
       </w:r>
+    </w:p>
+    <w:p>
       <w:r>
-        <w:t xml:space="preserve"> + </w:t>
-      </w:r>
-      <w:r>
-        <w:rPr>
-          <w:rFonts w:ascii="Consolas" w:hAnsi="Consolas"/>
-          <w:sz w:val="20"/>
-        </w:rPr>
-        <w:t>03_Outputs/Charts/sig_calculus_ab.png</w:t>
+        <w:t>· https://github.com/Brothermoses/aquacascade-ai/blob/main/03_Outputs/Charts/sig_depth_ab.png</w:t>
       </w:r>
     </w:p>
     <w:p>
@@ -1768,14 +1738,30 @@
         <w:pStyle w:val="ListBullet"/>
       </w:pPr>
       <w:r>
-        <w:rPr>
-          <w:rFonts w:ascii="Consolas" w:hAnsi="Consolas"/>
-          <w:sz w:val="20"/>
-        </w:rPr>
-        <w:t>05_Modeling/signature_pipeline.py</w:t>
+        <w:t>Itô vs Stratonovich A/B (script + JSON + chart):</w:t>
       </w:r>
+    </w:p>
+    <w:p>
       <w:r>
-        <w:t xml:space="preserve"> (canonical pipeline — </w:t>
+        <w:t>https://github.com/Brothermoses/aquacascade-ai/blob/main/05_Modeling/sig_calculus_ab.py</w:t>
+      </w:r>
+    </w:p>
+    <w:p>
+      <w:r>
+        <w:t>· https://github.com/Brothermoses/aquacascade-ai/blob/main/05_Modeling/sig_calculus_ab_results.json</w:t>
+      </w:r>
+    </w:p>
+    <w:p>
+      <w:r>
+        <w:t>· https://github.com/Brothermoses/aquacascade-ai/blob/main/03_Outputs/Charts/sig_calculus_ab.png</w:t>
+      </w:r>
+    </w:p>
+    <w:p>
+      <w:pPr>
+        <w:pStyle w:val="ListBullet"/>
+      </w:pPr>
+      <w:r>
+        <w:t>Canonical pipeline (</w:t>
       </w:r>
       <w:r>
         <w:rPr>
@@ -1785,7 +1771,12 @@
         <w:t>signatures_ex(depth=3, calculus="strat")</w:t>
       </w:r>
       <w:r>
-        <w:t xml:space="preserve"> is now the default)</w:t>
+        <w:t xml:space="preserve"> default):</w:t>
+      </w:r>
+    </w:p>
+    <w:p>
+      <w:r>
+        <w:t>https://github.com/Brothermoses/aquacascade-ai/blob/main/05_Modeling/signature_pipeline.py</w:t>
       </w:r>
     </w:p>
     <w:p>
@@ -1793,14 +1784,7 @@
         <w:pStyle w:val="ListBullet"/>
       </w:pPr>
       <w:r>
-        <w:rPr>
-          <w:rFonts w:ascii="Consolas" w:hAnsi="Consolas"/>
-          <w:sz w:val="20"/>
-        </w:rPr>
-        <w:t>06_Reports/A_Methods_Decision_Log.md</w:t>
-      </w:r>
-      <w:r>
-        <w:t xml:space="preserve"> §5–6 (decision narrative)</w:t>
+        <w:t>Decision narrative: https://github.com/Brothermoses/aquacascade-ai/blob/main/06_Reports/A_Methods_Decision_Log.md (sections 5–6)</w:t>
       </w:r>
     </w:p>
     <w:sectPr>

</xml_diff>